<commit_message>
Update Playwright admin tests for Firebase authentication and added admin's credential to admin docs
</commit_message>
<xml_diff>
--- a/docs/Word_Complex_Admin_User_Guide.docx
+++ b/docs/Word_Complex_Admin_User_Guide.docx
@@ -35,10 +35,72 @@
         <w:t xml:space="preserve">Access: </w:t>
       </w:r>
       <w:r>
-        <w:t>Only users with the Admin role and permission can access this page.</w:t>
+        <w:t xml:space="preserve">Only users with the </w:t>
+      </w:r>
+      <w:proofErr w:type="gramStart"/>
+      <w:r>
+        <w:t>Admin</w:t>
+      </w:r>
+      <w:proofErr w:type="gramEnd"/>
+      <w:r>
+        <w:t xml:space="preserve"> role and permission can access this page.</w:t>
       </w:r>
       <w:r>
         <w:br/>
+      </w:r>
+    </w:p>
+    <w:p>
+      <w:pPr>
+        <w:rPr>
+          <w:rFonts w:asciiTheme="majorHAnsi" w:hAnsiTheme="majorHAnsi" w:cstheme="majorHAnsi"/>
+          <w:b/>
+          <w:bCs/>
+          <w:color w:val="1F497D" w:themeColor="text2"/>
+          <w:sz w:val="28"/>
+          <w:szCs w:val="28"/>
+        </w:rPr>
+      </w:pPr>
+      <w:r>
+        <w:rPr>
+          <w:rFonts w:asciiTheme="majorHAnsi" w:hAnsiTheme="majorHAnsi" w:cstheme="majorHAnsi"/>
+          <w:b/>
+          <w:bCs/>
+          <w:color w:val="1F497D" w:themeColor="text2"/>
+          <w:sz w:val="28"/>
+          <w:szCs w:val="28"/>
+        </w:rPr>
+        <w:t>Admin Credentials</w:t>
+      </w:r>
+    </w:p>
+    <w:p>
+      <w:r>
+        <w:rPr>
+          <w:b/>
+          <w:bCs/>
+        </w:rPr>
+        <w:t>Username:</w:t>
+      </w:r>
+      <w:r>
+        <w:t xml:space="preserve"> </w:t>
+      </w:r>
+      <w:r>
+        <w:t>wordcomplexadmin@gmail.com</w:t>
+      </w:r>
+      <w:r>
+        <w:br/>
+      </w:r>
+      <w:r>
+        <w:rPr>
+          <w:b/>
+          <w:bCs/>
+        </w:rPr>
+        <w:t>Password:</w:t>
+      </w:r>
+      <w:r>
+        <w:t xml:space="preserve"> </w:t>
+      </w:r>
+      <w:r>
+        <w:t>Admin11223344#</w:t>
       </w:r>
     </w:p>
     <w:p>
@@ -136,7 +198,11 @@
       </w:r>
       <w:r>
         <w:br/>
-        <w:t>4. The system automatically cleans the content, parses the story, tokenizes both Sanskrit and English text, and stores the processed story in the MongoDB 'tokenized_stories' collection.</w:t>
+        <w:t xml:space="preserve">4. The system automatically cleans the content, parses the story, tokenizes both Sanskrit </w:t>
+      </w:r>
+      <w:r>
+        <w:lastRenderedPageBreak/>
+        <w:t>and English text, and stores the processed story in the MongoDB 'tokenized_stories' collection.</w:t>
       </w:r>
       <w:r>
         <w:br/>
@@ -148,7 +214,6 @@
         <w:pStyle w:val="Heading1"/>
       </w:pPr>
       <w:r>
-        <w:lastRenderedPageBreak/>
         <w:t>4. Downloading Stories from Online Resources</w:t>
       </w:r>
     </w:p>
@@ -282,6 +347,7 @@
         <w:pStyle w:val="Heading1"/>
       </w:pPr>
       <w:r>
+        <w:lastRenderedPageBreak/>
         <w:t>9. Editing Tokenized Stories</w:t>
       </w:r>
     </w:p>
@@ -294,9 +360,6 @@
       </w:r>
       <w:r>
         <w:br/>
-      </w:r>
-      <w:r>
-        <w:lastRenderedPageBreak/>
         <w:t>Expand a story using the arrow beside its title.</w:t>
       </w:r>
       <w:r>

</xml_diff>